<commit_message>
Document: derive the min form, declare the clip ours, add the internal-gate check
Section B no longer presents two things as the paper's that are not: the clip
in D (lower bound is the paper's cutoff row written into the drive, upper bound a
numerical guard for node overshoot in the chain) and the single-expression
min(1, V_DS/V'_D0) form, which is now derived from the paper's two conducting
rows instead of asserted.

Section L gains a subsection comparing the selected file-only model's internal
gate with the probed transistor gate on ex2 and inv_chain (Table XI, Fig. 12):
0.03-0.08 low, 12-74 ps early, faster return on ex2 - the structure produces a
gate that resembles the transistor's although nothing was fitted to it.

Rendered through Word: 23 pages, 349 equations, 14 figures, 13 tables.

Co-Authored-By: Claude Fable 5.1 <noreply@anthropic.com>
</commit_message>
<xml_diff>
--- a/results/stage_law_doc_2026-10-01/stage_law_derivation_v2.docx
+++ b/results/stage_law_doc_2026-10-01/stage_law_derivation_v2.docx
@@ -1354,92 +1354,406 @@
         <w:t xml:space="preserve"> </w:t>
       </w:r>
       <w:r>
-        <w:t xml:space="preserve">for strongly velocity-saturated devices). The lower clip in (5) encodes the cutoff row of (2); the upper clip expresses</w:t>
-      </w:r>
-      <w:r>
-        <w:t xml:space="preserve"> </w:t>
+        <w:t xml:space="preserve">for strongly velocity-saturated devices). The clip is our notation and does not appear in [1]: its lower bound is the cutoff row of (2) written into the drive, and its upper bound is a numerical guard for the chain of Section II-G, in which a stage output may overshoot its rail by a few percent for a few time steps. In the paper's own setting the gate never exceeds the supply and the upper bound is never reached.</w:t>
+      </w:r>
+    </w:p>
+    <w:p>
+      <w:pPr>
+        <w:pStyle w:val="FirstParagraph"/>
+      </w:pPr>
+      <w:r>
+        <w:t xml:space="preserve">Equation (2) has no single-expression form in [1]; the one used here is ours, and it follows from factoring </w:t>
       </w:r>
       <m:oMath>
+        <m:r>
+          <m:t xml:space="preserve">I</m:t>
+        </m:r>
         <m:sSub>
           <m:e>
             <m:r>
-              <m:t>V</m:t>
+              <m:rPr>
+                <m:sty m:val="p"/>
+              </m:rPr>
+              <m:t xml:space="preserve">'</m:t>
             </m:r>
           </m:e>
           <m:sub>
             <m:r>
-              <m:t>G</m:t>
-            </m:r>
-            <m:r>
-              <m:t>S</m:t>
-            </m:r>
-          </m:sub>
-        </m:sSub>
-        <m:r>
-          <m:rPr>
-            <m:sty m:val="p"/>
-          </m:rPr>
-          <m:t>≤</m:t>
-        </m:r>
-        <m:sSub>
-          <m:e>
-            <m:r>
-              <m:t>V</m:t>
-            </m:r>
-          </m:e>
-          <m:sub>
-            <m:r>
-              <m:t>D</m:t>
-            </m:r>
-            <m:r>
-              <m:t>D</m:t>
+              <m:t xml:space="preserve">D</m:t>
+            </m:r>
+            <m:r>
+              <m:rPr>
+                <m:sty m:val="p"/>
+              </m:rPr>
+              <m:t xml:space="preserve">0</m:t>
             </m:r>
           </m:sub>
         </m:sSub>
       </m:oMath>
       <w:r>
-        <w:t xml:space="preserve">.</w:t>
+        <w:t xml:space="preserve"> out of the triode row. The two conducting rows then read</w:t>
       </w:r>
     </w:p>
     <w:p>
       <w:pPr>
         <w:pStyle w:val="BodyText"/>
       </w:pPr>
-      <w:r>
-        <w:t xml:space="preserve">Because (2) is piecewise linear in</w:t>
-      </w:r>
-      <w:r>
-        <w:t xml:space="preserve"> </w:t>
+      <m:oMathPara>
+        <m:oMathParaPr>
+          <m:jc m:val="center"/>
+        </m:oMathParaPr>
+        <m:oMath>
+          <m:sSub>
+            <m:e>
+              <m:r>
+                <m:t xml:space="preserve">I</m:t>
+              </m:r>
+            </m:e>
+            <m:sub>
+              <m:r>
+                <m:t xml:space="preserve">D</m:t>
+              </m:r>
+            </m:sub>
+          </m:sSub>
+          <m:r>
+            <m:rPr>
+              <m:sty m:val="p"/>
+            </m:rPr>
+            <m:t xml:space="preserve">=</m:t>
+          </m:r>
+          <m:r>
+            <m:t xml:space="preserve">I</m:t>
+          </m:r>
+          <m:sSub>
+            <m:e>
+              <m:r>
+                <m:rPr>
+                  <m:sty m:val="p"/>
+                </m:rPr>
+                <m:t xml:space="preserve">'</m:t>
+              </m:r>
+            </m:e>
+            <m:sub>
+              <m:r>
+                <m:t xml:space="preserve">D</m:t>
+              </m:r>
+              <m:r>
+                <m:rPr>
+                  <m:sty m:val="p"/>
+                </m:rPr>
+                <m:t xml:space="preserve">0</m:t>
+              </m:r>
+            </m:sub>
+          </m:sSub>
+          <m:r>
+            <m:t xml:space="preserve">⋅</m:t>
+          </m:r>
+          <m:f>
+            <m:num>
+              <m:sSub>
+                <m:e>
+                  <m:r>
+                    <m:t xml:space="preserve">V</m:t>
+                  </m:r>
+                </m:e>
+                <m:sub>
+                  <m:r>
+                    <m:t xml:space="preserve">D</m:t>
+                  </m:r>
+                  <m:r>
+                    <m:t xml:space="preserve">S</m:t>
+                  </m:r>
+                </m:sub>
+              </m:sSub>
+            </m:num>
+            <m:den>
+              <m:r>
+                <m:t xml:space="preserve">V</m:t>
+              </m:r>
+              <m:sSub>
+                <m:e>
+                  <m:r>
+                    <m:rPr>
+                      <m:sty m:val="p"/>
+                    </m:rPr>
+                    <m:t xml:space="preserve">'</m:t>
+                  </m:r>
+                </m:e>
+                <m:sub>
+                  <m:r>
+                    <m:t xml:space="preserve">D</m:t>
+                  </m:r>
+                  <m:r>
+                    <m:rPr>
+                      <m:sty m:val="p"/>
+                    </m:rPr>
+                    <m:t xml:space="preserve">0</m:t>
+                  </m:r>
+                </m:sub>
+              </m:sSub>
+            </m:den>
+          </m:f>
+          <m:r>
+            <m:rPr>
+              <m:sty m:val="p"/>
+            </m:rPr>
+            <m:t xml:space="preserve"> </m:t>
+          </m:r>
+          <m:r>
+            <m:rPr>
+              <m:sty m:val="p"/>
+            </m:rPr>
+            <m:t xml:space="preserve"> </m:t>
+          </m:r>
+          <m:r>
+            <m:rPr>
+              <m:sty m:val="p"/>
+            </m:rPr>
+            <m:t xml:space="preserve">(</m:t>
+          </m:r>
+          <m:sSub>
+            <m:e>
+              <m:r>
+                <m:t xml:space="preserve">V</m:t>
+              </m:r>
+            </m:e>
+            <m:sub>
+              <m:r>
+                <m:t xml:space="preserve">D</m:t>
+              </m:r>
+              <m:r>
+                <m:t xml:space="preserve">S</m:t>
+              </m:r>
+            </m:sub>
+          </m:sSub>
+          <m:r>
+            <m:rPr>
+              <m:sty m:val="p"/>
+            </m:rPr>
+            <m:t xml:space="preserve">&lt;</m:t>
+          </m:r>
+          <m:r>
+            <m:t xml:space="preserve">V</m:t>
+          </m:r>
+          <m:sSub>
+            <m:e>
+              <m:r>
+                <m:rPr>
+                  <m:sty m:val="p"/>
+                </m:rPr>
+                <m:t xml:space="preserve">'</m:t>
+              </m:r>
+            </m:e>
+            <m:sub>
+              <m:r>
+                <m:t xml:space="preserve">D</m:t>
+              </m:r>
+              <m:r>
+                <m:rPr>
+                  <m:sty m:val="p"/>
+                </m:rPr>
+                <m:t xml:space="preserve">0</m:t>
+              </m:r>
+            </m:sub>
+          </m:sSub>
+          <m:r>
+            <m:rPr>
+              <m:sty m:val="p"/>
+            </m:rPr>
+            <m:t xml:space="preserve">)</m:t>
+          </m:r>
+          <m:r>
+            <m:rPr>
+              <m:sty m:val="p"/>
+            </m:rPr>
+            <m:t xml:space="preserve">,</m:t>
+          </m:r>
+          <m:r>
+            <m:rPr>
+              <m:sty m:val="p"/>
+            </m:rPr>
+            <m:t xml:space="preserve"> </m:t>
+          </m:r>
+          <m:sSub>
+            <m:e>
+              <m:r>
+                <m:t xml:space="preserve">I</m:t>
+              </m:r>
+            </m:e>
+            <m:sub>
+              <m:r>
+                <m:t xml:space="preserve">D</m:t>
+              </m:r>
+            </m:sub>
+          </m:sSub>
+          <m:r>
+            <m:rPr>
+              <m:sty m:val="p"/>
+            </m:rPr>
+            <m:t xml:space="preserve">=</m:t>
+          </m:r>
+          <m:r>
+            <m:t xml:space="preserve">I</m:t>
+          </m:r>
+          <m:sSub>
+            <m:e>
+              <m:r>
+                <m:rPr>
+                  <m:sty m:val="p"/>
+                </m:rPr>
+                <m:t xml:space="preserve">'</m:t>
+              </m:r>
+            </m:e>
+            <m:sub>
+              <m:r>
+                <m:t xml:space="preserve">D</m:t>
+              </m:r>
+              <m:r>
+                <m:rPr>
+                  <m:sty m:val="p"/>
+                </m:rPr>
+                <m:t xml:space="preserve">0</m:t>
+              </m:r>
+            </m:sub>
+          </m:sSub>
+          <m:r>
+            <m:t xml:space="preserve">⋅</m:t>
+          </m:r>
+          <m:r>
+            <m:rPr>
+              <m:sty m:val="p"/>
+            </m:rPr>
+            <m:t xml:space="preserve">1</m:t>
+          </m:r>
+          <m:r>
+            <m:rPr>
+              <m:sty m:val="p"/>
+            </m:rPr>
+            <m:t xml:space="preserve"> </m:t>
+          </m:r>
+          <m:r>
+            <m:rPr>
+              <m:sty m:val="p"/>
+            </m:rPr>
+            <m:t xml:space="preserve"> </m:t>
+          </m:r>
+          <m:r>
+            <m:rPr>
+              <m:sty m:val="p"/>
+            </m:rPr>
+            <m:t xml:space="preserve">(</m:t>
+          </m:r>
+          <m:sSub>
+            <m:e>
+              <m:r>
+                <m:t xml:space="preserve">V</m:t>
+              </m:r>
+            </m:e>
+            <m:sub>
+              <m:r>
+                <m:t xml:space="preserve">D</m:t>
+              </m:r>
+              <m:r>
+                <m:t xml:space="preserve">S</m:t>
+              </m:r>
+            </m:sub>
+          </m:sSub>
+          <m:r>
+            <m:t xml:space="preserve">≥</m:t>
+          </m:r>
+          <m:r>
+            <m:t xml:space="preserve">V</m:t>
+          </m:r>
+          <m:sSub>
+            <m:e>
+              <m:r>
+                <m:rPr>
+                  <m:sty m:val="p"/>
+                </m:rPr>
+                <m:t xml:space="preserve">'</m:t>
+              </m:r>
+            </m:e>
+            <m:sub>
+              <m:r>
+                <m:t xml:space="preserve">D</m:t>
+              </m:r>
+              <m:r>
+                <m:rPr>
+                  <m:sty m:val="p"/>
+                </m:rPr>
+                <m:t xml:space="preserve">0</m:t>
+              </m:r>
+            </m:sub>
+          </m:sSub>
+          <m:r>
+            <m:rPr>
+              <m:sty m:val="p"/>
+            </m:rPr>
+            <m:t xml:space="preserve">)</m:t>
+          </m:r>
+        </m:oMath>
+      </m:oMathPara>
+    </w:p>
+    <w:p>
+      <w:pPr>
+        <w:pStyle w:val="FirstParagraph"/>
+      </w:pPr>
+      <w:r>
+        <w:t xml:space="preserve">In the first row the ratio </w:t>
       </w:r>
       <m:oMath>
         <m:sSub>
           <m:e>
             <m:r>
-              <m:t>V</m:t>
+              <m:t xml:space="preserve">V</m:t>
             </m:r>
           </m:e>
           <m:sub>
             <m:r>
-              <m:t>D</m:t>
-            </m:r>
-            <m:r>
-              <m:t>S</m:t>
+              <m:t xml:space="preserve">D</m:t>
+            </m:r>
+            <m:r>
+              <m:t xml:space="preserve">S</m:t>
+            </m:r>
+          </m:sub>
+        </m:sSub>
+        <m:r>
+          <m:rPr>
+            <m:sty m:val="p"/>
+          </m:rPr>
+          <m:t xml:space="preserve">/</m:t>
+        </m:r>
+        <m:r>
+          <m:t xml:space="preserve">V</m:t>
+        </m:r>
+        <m:sSub>
+          <m:e>
+            <m:r>
+              <m:rPr>
+                <m:sty m:val="p"/>
+              </m:rPr>
+              <m:t xml:space="preserve">'</m:t>
+            </m:r>
+          </m:e>
+          <m:sub>
+            <m:r>
+              <m:t xml:space="preserve">D</m:t>
+            </m:r>
+            <m:r>
+              <m:rPr>
+                <m:sty m:val="p"/>
+              </m:rPr>
+              <m:t xml:space="preserve">0</m:t>
             </m:r>
           </m:sub>
         </m:sSub>
       </m:oMath>
       <w:r>
-        <w:t xml:space="preserve"> </w:t>
-      </w:r>
-      <w:r>
-        <w:t xml:space="preserve">up to</w:t>
-      </w:r>
-      <w:r>
-        <w:t xml:space="preserve"> </w:t>
+        <w:t xml:space="preserve"> is below 1 and in the second it is 1 or above, so in each row the multiplier of </w:t>
       </w:r>
       <m:oMath>
         <m:r>
-          <m:t>V</m:t>
+          <m:t xml:space="preserve">I</m:t>
         </m:r>
         <m:sSub>
           <m:e>
@@ -1447,24 +1761,153 @@
               <m:rPr>
                 <m:sty m:val="p"/>
               </m:rPr>
-              <m:t>′</m:t>
+              <m:t xml:space="preserve">'</m:t>
             </m:r>
           </m:e>
           <m:sub>
             <m:r>
-              <m:t>D</m:t>
-            </m:r>
-            <m:r>
-              <m:t>0</m:t>
+              <m:t xml:space="preserve">D</m:t>
+            </m:r>
+            <m:r>
+              <m:rPr>
+                <m:sty m:val="p"/>
+              </m:rPr>
+              <m:t xml:space="preserve">0</m:t>
             </m:r>
           </m:sub>
         </m:sSub>
       </m:oMath>
       <w:r>
-        <w:t xml:space="preserve"> </w:t>
-      </w:r>
-      <w:r>
-        <w:t xml:space="preserve">and constant beyond it, its two conducting rows collapse to a single expression:</w:t>
+        <w:t xml:space="preserve"> is whichever of 1 and </w:t>
+      </w:r>
+      <m:oMath>
+        <m:sSub>
+          <m:e>
+            <m:r>
+              <m:t xml:space="preserve">V</m:t>
+            </m:r>
+          </m:e>
+          <m:sub>
+            <m:r>
+              <m:t xml:space="preserve">D</m:t>
+            </m:r>
+            <m:r>
+              <m:t xml:space="preserve">S</m:t>
+            </m:r>
+          </m:sub>
+        </m:sSub>
+        <m:r>
+          <m:rPr>
+            <m:sty m:val="p"/>
+          </m:rPr>
+          <m:t xml:space="preserve">/</m:t>
+        </m:r>
+        <m:r>
+          <m:t xml:space="preserve">V</m:t>
+        </m:r>
+        <m:sSub>
+          <m:e>
+            <m:r>
+              <m:rPr>
+                <m:sty m:val="p"/>
+              </m:rPr>
+              <m:t xml:space="preserve">'</m:t>
+            </m:r>
+          </m:e>
+          <m:sub>
+            <m:r>
+              <m:t xml:space="preserve">D</m:t>
+            </m:r>
+            <m:r>
+              <m:rPr>
+                <m:sty m:val="p"/>
+              </m:rPr>
+              <m:t xml:space="preserve">0</m:t>
+            </m:r>
+          </m:sub>
+        </m:sSub>
+      </m:oMath>
+      <w:r>
+        <w:t xml:space="preserve"> is the smaller. The two rows meet at </w:t>
+      </w:r>
+      <m:oMath>
+        <m:sSub>
+          <m:e>
+            <m:r>
+              <m:t xml:space="preserve">V</m:t>
+            </m:r>
+          </m:e>
+          <m:sub>
+            <m:r>
+              <m:t xml:space="preserve">D</m:t>
+            </m:r>
+            <m:r>
+              <m:t xml:space="preserve">S</m:t>
+            </m:r>
+          </m:sub>
+        </m:sSub>
+        <m:r>
+          <m:rPr>
+            <m:sty m:val="p"/>
+          </m:rPr>
+          <m:t xml:space="preserve">=</m:t>
+        </m:r>
+        <m:r>
+          <m:t xml:space="preserve">V</m:t>
+        </m:r>
+        <m:sSub>
+          <m:e>
+            <m:r>
+              <m:rPr>
+                <m:sty m:val="p"/>
+              </m:rPr>
+              <m:t xml:space="preserve">'</m:t>
+            </m:r>
+          </m:e>
+          <m:sub>
+            <m:r>
+              <m:t xml:space="preserve">D</m:t>
+            </m:r>
+            <m:r>
+              <m:rPr>
+                <m:sty m:val="p"/>
+              </m:rPr>
+              <m:t xml:space="preserve">0</m:t>
+            </m:r>
+          </m:sub>
+        </m:sSub>
+      </m:oMath>
+      <w:r>
+        <w:t xml:space="preserve">, where both give </w:t>
+      </w:r>
+      <m:oMath>
+        <m:r>
+          <m:t xml:space="preserve">I</m:t>
+        </m:r>
+        <m:sSub>
+          <m:e>
+            <m:r>
+              <m:rPr>
+                <m:sty m:val="p"/>
+              </m:rPr>
+              <m:t xml:space="preserve">'</m:t>
+            </m:r>
+          </m:e>
+          <m:sub>
+            <m:r>
+              <m:t xml:space="preserve">D</m:t>
+            </m:r>
+            <m:r>
+              <m:rPr>
+                <m:sty m:val="p"/>
+              </m:rPr>
+              <m:t xml:space="preserve">0</m:t>
+            </m:r>
+          </m:sub>
+        </m:sSub>
+      </m:oMath>
+      <w:r>
+        <w:t xml:space="preserve">, and the current is continuous. The conducting part of (2) is therefore</w:t>
       </w:r>
     </w:p>
     <w:p>
@@ -20260,7 +20703,7 @@
         <w:pStyle w:val="Heading3"/>
       </w:pPr>
       <w:r>
-        <w:t xml:space="preserve">2) Pad level: the complete method on twelve buffers</w:t>
+        <w:t xml:space="preserve">2) The model's internal gate against the transistor's</w:t>
       </w:r>
     </w:p>
     <w:p>
@@ -20268,34 +20711,414 @@
         <w:pStyle w:val="FirstParagraph"/>
       </w:pPr>
       <w:r>
-        <w:t xml:space="preserve">The complete procedure of Table III was applied to twelve test buffers: ex2, inv_chain and io_buf, and nine variants of the first two. For each buffer the model was built from its IBIS file and from one transistor-level pad waveform at the pulse width giving about 50 % of the settled swing; </w:t>
+        <w:t xml:space="preserve">The file-only model is judged at the pad; its internal gate </w:t>
       </w:r>
       <m:oMath>
         <m:sSub>
           <m:e>
             <m:r>
-              <m:t xml:space="preserve">C</m:t>
+              <m:t xml:space="preserve">G</m:t>
             </m:r>
           </m:e>
           <m:sub>
             <m:r>
-              <m:t xml:space="preserve">c</m:t>
-            </m:r>
-            <m:r>
-              <m:t xml:space="preserve">o</m:t>
-            </m:r>
-            <m:r>
-              <m:t xml:space="preserve">m</m:t>
-            </m:r>
-            <m:r>
-              <m:t xml:space="preserve">p</m:t>
+              <m:t xml:space="preserve">U</m:t>
+            </m:r>
+            <m:r>
+              <m:t xml:space="preserve">P</m:t>
             </m:r>
           </m:sub>
         </m:sSub>
       </m:oMath>
       <w:r>
-        <w:t xml:space="preserve"> was taken from the file, reduced where the declared value implied a conducting fraction above unity. The model was then simulated at five pulse widths (about 50 to 90 % of the settled swing) into the same load and compared with transistor-level simulation of the same buffer. The score is the worst peak error over the five widths, with the peak error defined as in (28). The calibration width is one of the five, so the score is not entirely held out. HSPICE's native IBIS element with the same file is given for comparison.</w:t>
-      </w:r>
+        <w:t xml:space="preserve"> is never fitted to anything and the method never observes a gate. On the two buffers whose gate was probed, the gate of the selected file-only build can nevertheless be compared with the real one (Fig. 12, Table XI).</w:t>
+      </w:r>
+    </w:p>
+    <w:p>
+      <w:pPr>
+        <w:pStyle w:val="TableCaption"/>
+      </w:pPr>
+      <w:r>
+        <w:t xml:space="preserve">Table XI: Peak of the model's internal gate minus the peak of the probed gate, at the five stressed widths (ex2: 810–975 ps; inv_chain: 104–135 ps)</w:t>
+      </w:r>
+    </w:p>
+    <w:tbl>
+      <w:tblPr>
+        <w:tblStyle w:val="Table"/>
+        <w:tblW w:type="dxa" w:w="9600"/>
+        <w:tblBorders>
+          <w:top w:val="single" w:sz="6" w:space="0" w:color="000000"/>
+          <w:bottom w:val="single" w:sz="6" w:space="0" w:color="000000"/>
+        </w:tblBorders>
+        <w:tblLayout w:type="fixed"/>
+        <w:tblLook w:firstRow="1" w:lastRow="0" w:firstColumn="0" w:lastColumn="0" w:noHBand="0" w:noVBand="0" w:val="0020"/>
+      </w:tblPr>
+      <w:tblGrid>
+        <w:gridCol w:w="1600"/>
+        <w:gridCol w:w="1200"/>
+        <w:gridCol w:w="1200"/>
+        <w:gridCol w:w="1200"/>
+        <w:gridCol w:w="1200"/>
+        <w:gridCol w:w="1300"/>
+        <w:gridCol w:w="1900"/>
+      </w:tblGrid>
+      <w:tr>
+        <w:trPr>
+          <w:tblHeader/>
+        </w:trPr>
+        <w:tc>
+          <w:tcPr>
+            <w:tcW w:w="1600" w:type="dxa"/>
+          </w:tcPr>
+          <w:p>
+            <w:pPr>
+              <w:pStyle w:val="Compact"/>
+              <w:jc w:val="left"/>
+            </w:pPr>
+            <w:r>
+              <w:rPr>
+                <w:b/>
+                <w:sz w:val="18"/>
+              </w:rPr>
+              <w:t xml:space="preserve">Buffer</w:t>
+            </w:r>
+          </w:p>
+        </w:tc>
+        <w:tc>
+          <w:tcPr>
+            <w:tcW w:w="1200" w:type="dxa"/>
+          </w:tcPr>
+          <w:p>
+            <w:pPr>
+              <w:pStyle w:val="Compact"/>
+              <w:jc w:val="left"/>
+            </w:pPr>
+            <w:r>
+              <w:rPr>
+                <w:b/>
+                <w:sz w:val="18"/>
+              </w:rPr>
+              <w:t xml:space="preserve">Narrowest</w:t>
+            </w:r>
+          </w:p>
+        </w:tc>
+        <w:tc>
+          <w:tcPr>
+            <w:tcW w:w="1200" w:type="dxa"/>
+          </w:tcPr>
+          <w:p>
+            <w:pPr>
+              <w:pStyle w:val="Compact"/>
+              <w:jc w:val="left"/>
+            </w:pPr>
+          </w:p>
+        </w:tc>
+        <w:tc>
+          <w:tcPr>
+            <w:tcW w:w="1200" w:type="dxa"/>
+          </w:tcPr>
+          <w:p>
+            <w:pPr>
+              <w:pStyle w:val="Compact"/>
+              <w:jc w:val="left"/>
+            </w:pPr>
+          </w:p>
+        </w:tc>
+        <w:tc>
+          <w:tcPr>
+            <w:tcW w:w="1200" w:type="dxa"/>
+          </w:tcPr>
+          <w:p>
+            <w:pPr>
+              <w:pStyle w:val="Compact"/>
+              <w:jc w:val="left"/>
+            </w:pPr>
+          </w:p>
+        </w:tc>
+        <w:tc>
+          <w:tcPr>
+            <w:tcW w:w="1300" w:type="dxa"/>
+          </w:tcPr>
+          <w:p>
+            <w:pPr>
+              <w:pStyle w:val="Compact"/>
+              <w:jc w:val="left"/>
+            </w:pPr>
+            <w:r>
+              <w:rPr>
+                <w:b/>
+                <w:sz w:val="18"/>
+              </w:rPr>
+              <w:t xml:space="preserve">Widest pulse</w:t>
+            </w:r>
+          </w:p>
+        </w:tc>
+        <w:tc>
+          <w:tcPr>
+            <w:tcW w:w="1900" w:type="dxa"/>
+          </w:tcPr>
+          <w:p>
+            <w:pPr>
+              <w:pStyle w:val="Compact"/>
+              <w:jc w:val="left"/>
+            </w:pPr>
+            <w:r>
+              <w:rPr>
+                <w:b/>
+                <w:sz w:val="18"/>
+              </w:rPr>
+              <w:t xml:space="preserve">Waveform rms</w:t>
+            </w:r>
+          </w:p>
+        </w:tc>
+      </w:tr>
+      <w:tr>
+        <w:tc>
+          <w:tcPr>
+            <w:tcW w:w="1600" w:type="dxa"/>
+          </w:tcPr>
+          <w:p>
+            <w:pPr>
+              <w:pStyle w:val="Compact"/>
+              <w:jc w:val="left"/>
+            </w:pPr>
+            <w:r>
+              <w:rPr>
+                <w:sz w:val="18"/>
+              </w:rPr>
+              <w:t xml:space="preserve">ex2</w:t>
+            </w:r>
+          </w:p>
+        </w:tc>
+        <w:tc>
+          <w:tcPr>
+            <w:tcW w:w="1200" w:type="dxa"/>
+          </w:tcPr>
+          <w:p>
+            <w:pPr>
+              <w:pStyle w:val="Compact"/>
+              <w:jc w:val="left"/>
+            </w:pPr>
+            <w:r>
+              <w:rPr>
+                <w:sz w:val="18"/>
+              </w:rPr>
+              <w:t xml:space="preserve">-0.053</w:t>
+            </w:r>
+          </w:p>
+        </w:tc>
+        <w:tc>
+          <w:tcPr>
+            <w:tcW w:w="1200" w:type="dxa"/>
+          </w:tcPr>
+          <w:p>
+            <w:pPr>
+              <w:pStyle w:val="Compact"/>
+              <w:jc w:val="left"/>
+            </w:pPr>
+            <w:r>
+              <w:rPr>
+                <w:sz w:val="18"/>
+              </w:rPr>
+              <w:t xml:space="preserve">-0.050</w:t>
+            </w:r>
+          </w:p>
+        </w:tc>
+        <w:tc>
+          <w:tcPr>
+            <w:tcW w:w="1200" w:type="dxa"/>
+          </w:tcPr>
+          <w:p>
+            <w:pPr>
+              <w:pStyle w:val="Compact"/>
+              <w:jc w:val="left"/>
+            </w:pPr>
+            <w:r>
+              <w:rPr>
+                <w:sz w:val="18"/>
+              </w:rPr>
+              <w:t xml:space="preserve">-0.042</w:t>
+            </w:r>
+          </w:p>
+        </w:tc>
+        <w:tc>
+          <w:tcPr>
+            <w:tcW w:w="1200" w:type="dxa"/>
+          </w:tcPr>
+          <w:p>
+            <w:pPr>
+              <w:pStyle w:val="Compact"/>
+              <w:jc w:val="left"/>
+            </w:pPr>
+            <w:r>
+              <w:rPr>
+                <w:sz w:val="18"/>
+              </w:rPr>
+              <w:t xml:space="preserve">-0.036</w:t>
+            </w:r>
+          </w:p>
+        </w:tc>
+        <w:tc>
+          <w:tcPr>
+            <w:tcW w:w="1300" w:type="dxa"/>
+          </w:tcPr>
+          <w:p>
+            <w:pPr>
+              <w:pStyle w:val="Compact"/>
+              <w:jc w:val="left"/>
+            </w:pPr>
+            <w:r>
+              <w:rPr>
+                <w:sz w:val="18"/>
+              </w:rPr>
+              <w:t xml:space="preserve">-0.025</w:t>
+            </w:r>
+          </w:p>
+        </w:tc>
+        <w:tc>
+          <w:tcPr>
+            <w:tcW w:w="1900" w:type="dxa"/>
+          </w:tcPr>
+          <w:p>
+            <w:pPr>
+              <w:pStyle w:val="Compact"/>
+              <w:jc w:val="left"/>
+            </w:pPr>
+            <w:r>
+              <w:rPr>
+                <w:sz w:val="18"/>
+              </w:rPr>
+              <w:t xml:space="preserve">0.06–0.08</w:t>
+            </w:r>
+          </w:p>
+        </w:tc>
+      </w:tr>
+      <w:tr>
+        <w:tc>
+          <w:tcPr>
+            <w:tcW w:w="1600" w:type="dxa"/>
+          </w:tcPr>
+          <w:p>
+            <w:pPr>
+              <w:pStyle w:val="Compact"/>
+              <w:jc w:val="left"/>
+            </w:pPr>
+            <w:r>
+              <w:rPr>
+                <w:sz w:val="18"/>
+              </w:rPr>
+              <w:t xml:space="preserve">inv_chain</w:t>
+            </w:r>
+          </w:p>
+        </w:tc>
+        <w:tc>
+          <w:tcPr>
+            <w:tcW w:w="1200" w:type="dxa"/>
+          </w:tcPr>
+          <w:p>
+            <w:pPr>
+              <w:pStyle w:val="Compact"/>
+              <w:jc w:val="left"/>
+            </w:pPr>
+            <w:r>
+              <w:rPr>
+                <w:sz w:val="18"/>
+              </w:rPr>
+              <w:t xml:space="preserve">-0.079</w:t>
+            </w:r>
+          </w:p>
+        </w:tc>
+        <w:tc>
+          <w:tcPr>
+            <w:tcW w:w="1200" w:type="dxa"/>
+          </w:tcPr>
+          <w:p>
+            <w:pPr>
+              <w:pStyle w:val="Compact"/>
+              <w:jc w:val="left"/>
+            </w:pPr>
+            <w:r>
+              <w:rPr>
+                <w:sz w:val="18"/>
+              </w:rPr>
+              <w:t xml:space="preserve">-0.061</w:t>
+            </w:r>
+          </w:p>
+        </w:tc>
+        <w:tc>
+          <w:tcPr>
+            <w:tcW w:w="1200" w:type="dxa"/>
+          </w:tcPr>
+          <w:p>
+            <w:pPr>
+              <w:pStyle w:val="Compact"/>
+              <w:jc w:val="left"/>
+            </w:pPr>
+            <w:r>
+              <w:rPr>
+                <w:sz w:val="18"/>
+              </w:rPr>
+              <w:t xml:space="preserve">-0.020</w:t>
+            </w:r>
+          </w:p>
+        </w:tc>
+        <w:tc>
+          <w:tcPr>
+            <w:tcW w:w="1200" w:type="dxa"/>
+          </w:tcPr>
+          <w:p>
+            <w:pPr>
+              <w:pStyle w:val="Compact"/>
+              <w:jc w:val="left"/>
+            </w:pPr>
+            <w:r>
+              <w:rPr>
+                <w:sz w:val="18"/>
+              </w:rPr>
+              <w:t xml:space="preserve">-0.009</w:t>
+            </w:r>
+          </w:p>
+        </w:tc>
+        <w:tc>
+          <w:tcPr>
+            <w:tcW w:w="1300" w:type="dxa"/>
+          </w:tcPr>
+          <w:p>
+            <w:pPr>
+              <w:pStyle w:val="Compact"/>
+              <w:jc w:val="left"/>
+            </w:pPr>
+            <w:r>
+              <w:rPr>
+                <w:sz w:val="18"/>
+              </w:rPr>
+              <w:t xml:space="preserve">-0.007</w:t>
+            </w:r>
+          </w:p>
+        </w:tc>
+        <w:tc>
+          <w:tcPr>
+            <w:tcW w:w="1900" w:type="dxa"/>
+          </w:tcPr>
+          <w:p>
+            <w:pPr>
+              <w:pStyle w:val="Compact"/>
+              <w:jc w:val="left"/>
+            </w:pPr>
+            <w:r>
+              <w:rPr>
+                <w:sz w:val="18"/>
+              </w:rPr>
+              <w:t xml:space="preserve">0.04–0.06</w:t>
+            </w:r>
+          </w:p>
+        </w:tc>
+      </w:tr>
+    </w:tbl>
+    <w:p>
+      <w:pPr>
+        <w:pStyle w:val="Compact"/>
+      </w:pPr>
     </w:p>
     <w:p>
       <w:pPr>
@@ -20305,7 +21128,7 @@
       <w:r>
         <w:drawing>
           <wp:inline distT="0" distB="0" distL="0" distR="0">
-            <wp:extent cx="5760720" cy="2864132"/>
+            <wp:extent cx="5669280" cy="3653358"/>
             <wp:docPr id="112" name="Figure 12"/>
             <wp:cNvGraphicFramePr>
               <a:graphicFrameLocks noChangeAspect="1"/>
@@ -20326,6 +21149,106 @@
                   <pic:spPr>
                     <a:xfrm>
                       <a:off x="0" y="0"/>
+                      <a:ext cx="5669280" cy="3653358"/>
+                    </a:xfrm>
+                    <a:prstGeom prst="rect">
+                      <a:avLst/>
+                    </a:prstGeom>
+                  </pic:spPr>
+                </pic:pic>
+              </a:graphicData>
+            </a:graphic>
+          </wp:inline>
+        </w:drawing>
+      </w:r>
+    </w:p>
+    <w:p>
+      <w:pPr>
+        <w:pStyle w:val="ImageCaption"/>
+      </w:pPr>
+      <w:r>
+        <w:t xml:space="preserve">Fig. 12. The internal gate of the selected file-only model against the probed gate of the transistor netlist, at full swing and at the narrowest and widest stressed pulse. (a) ex2. (b) inv_chain. The model was fitted to the IBIS file and one pad waveform only.</w:t>
+      </w:r>
+    </w:p>
+    <w:p>
+      <w:pPr>
+        <w:pStyle w:val="BodyText"/>
+      </w:pPr>
+      <w:r>
+        <w:t xml:space="preserve">The model's gate has the height and shape of the real one at every width, although nothing in the procedure aimed at the gate: its stressed peak is 0.03–0.05 low on ex2 and 0.01–0.08 low on inv_chain, and it leads the real gate by 56–74 ps on ex2 and 12–20 ps on inv_chain. It is not the same waveform: on ex2 it returns to zero faster than the real gate, and the map absorbs the difference at the pad. The structure of (19) therefore produces an internal gate that resembles the transistor's, while its numbers remain effective parameters and the internals remain approximate.</w:t>
+      </w:r>
+    </w:p>
+    <w:p>
+      <w:pPr>
+        <w:pStyle w:val="Heading3"/>
+      </w:pPr>
+      <w:r>
+        <w:t xml:space="preserve">3) Pad level: the complete method on twelve buffers</w:t>
+      </w:r>
+    </w:p>
+    <w:p>
+      <w:pPr>
+        <w:pStyle w:val="FirstParagraph"/>
+      </w:pPr>
+      <w:r>
+        <w:t xml:space="preserve">The complete procedure of Table III was applied to twelve test buffers: ex2, inv_chain and io_buf, and nine variants of the first two. For each buffer the model was built from its IBIS file and from one transistor-level pad waveform at the pulse width giving about 50 % of the settled swing; </w:t>
+      </w:r>
+      <m:oMath>
+        <m:sSub>
+          <m:e>
+            <m:r>
+              <m:t xml:space="preserve">C</m:t>
+            </m:r>
+          </m:e>
+          <m:sub>
+            <m:r>
+              <m:t xml:space="preserve">c</m:t>
+            </m:r>
+            <m:r>
+              <m:t xml:space="preserve">o</m:t>
+            </m:r>
+            <m:r>
+              <m:t xml:space="preserve">m</m:t>
+            </m:r>
+            <m:r>
+              <m:t xml:space="preserve">p</m:t>
+            </m:r>
+          </m:sub>
+        </m:sSub>
+      </m:oMath>
+      <w:r>
+        <w:t xml:space="preserve"> was taken from the file, reduced where the declared value implied a conducting fraction above unity. The model was then simulated at five pulse widths (about 50 to 90 % of the settled swing) into the same load and compared with transistor-level simulation of the same buffer. The score is the worst peak error over the five widths, with the peak error defined as in (28). The calibration width is one of the five, so the score is not entirely held out. HSPICE's native IBIS element with the same file is given for comparison.</w:t>
+      </w:r>
+    </w:p>
+    <w:p>
+      <w:pPr>
+        <w:pStyle w:val="CaptionedFigure"/>
+        <w:jc w:val="center"/>
+      </w:pPr>
+      <w:r>
+        <w:drawing>
+          <wp:inline distT="0" distB="0" distL="0" distR="0">
+            <wp:extent cx="5760720" cy="2864132"/>
+            <wp:docPr id="113" name="Figure 13"/>
+            <wp:cNvGraphicFramePr>
+              <a:graphicFrameLocks noChangeAspect="1"/>
+            </wp:cNvGraphicFramePr>
+            <a:graphic>
+              <a:graphicData uri="http://schemas.openxmlformats.org/drawingml/2006/picture">
+                <pic:pic>
+                  <pic:nvPicPr>
+                    <pic:cNvPr id="113" name="fig13.png"/>
+                    <pic:cNvPicPr/>
+                  </pic:nvPicPr>
+                  <pic:blipFill>
+                    <a:blip r:embed="rIdFig13"/>
+                    <a:stretch>
+                      <a:fillRect/>
+                    </a:stretch>
+                  </pic:blipFill>
+                  <pic:spPr>
+                    <a:xfrm>
+                      <a:off x="0" y="0"/>
                       <a:ext cx="5760720" cy="2864132"/>
                     </a:xfrm>
                     <a:prstGeom prst="rect">
@@ -20344,7 +21267,7 @@
         <w:pStyle w:val="ImageCaption"/>
       </w:pPr>
       <w:r>
-        <w:t xml:space="preserve">Fig. 12. Pad voltage for the narrowest stressed pulse of three buffers: transistor-level reference, HSPICE native IBIS, and the proposed model built from the IBIS file and one stressed measurement. The percentages are peak errors against the reference. Time is measured from the input edge.</w:t>
+        <w:t xml:space="preserve">Fig. 13. Pad voltage for the narrowest stressed pulse of three buffers: transistor-level reference, HSPICE native IBIS, and the proposed model built from the IBIS file and one stressed measurement. The percentages are peak errors against the reference. Time is measured from the input edge.</w:t>
       </w:r>
     </w:p>
     <w:p>
@@ -20352,7 +21275,7 @@
         <w:pStyle w:val="TableCaption"/>
       </w:pPr>
       <w:r>
-        <w:t xml:space="preserve">Table XI: Pad-level result on the twelve test buffers (worst of five stressed pulse widths)</w:t>
+        <w:t xml:space="preserve">Table XII: Pad-level result on the twelve test buffers (worst of five stressed pulse widths)</w:t>
       </w:r>
     </w:p>
     <w:tbl>
@@ -21758,7 +22681,7 @@
         <w:drawing>
           <wp:inline distT="0" distB="0" distL="0" distR="0">
             <wp:extent cx="5760720" cy="2965484"/>
-            <wp:docPr id="113" name="Figure 13"/>
+            <wp:docPr id="114" name="Figure 14"/>
             <wp:cNvGraphicFramePr>
               <a:graphicFrameLocks noChangeAspect="1"/>
             </wp:cNvGraphicFramePr>
@@ -21766,11 +22689,11 @@
               <a:graphicData uri="http://schemas.openxmlformats.org/drawingml/2006/picture">
                 <pic:pic>
                   <pic:nvPicPr>
-                    <pic:cNvPr id="113" name="fig13.png"/>
+                    <pic:cNvPr id="114" name="fig14.png"/>
                     <pic:cNvPicPr/>
                   </pic:nvPicPr>
                   <pic:blipFill>
-                    <a:blip r:embed="rIdFig13"/>
+                    <a:blip r:embed="rIdFig14"/>
                     <a:stretch>
                       <a:fillRect/>
                     </a:stretch>
@@ -21796,7 +22719,7 @@
         <w:pStyle w:val="ImageCaption"/>
       </w:pPr>
       <w:r>
-        <w:t xml:space="preserve">Fig. 13. Worst stressed peak error at the pad for the twelve test buffers.</w:t>
+        <w:t xml:space="preserve">Fig. 14. Worst stressed peak error at the pad for the twelve test buffers.</w:t>
       </w:r>
     </w:p>
     <w:p>
@@ -21812,7 +22735,7 @@
         <w:pStyle w:val="Heading3"/>
       </w:pPr>
       <w:r>
-        <w:t xml:space="preserve">3) Limits of the evidence</w:t>
+        <w:t xml:space="preserve">4) Limits of the evidence</w:t>
       </w:r>
     </w:p>
     <w:p>
@@ -21861,7 +22784,7 @@
         <w:pStyle w:val="TableCaption"/>
       </w:pPr>
       <w:r>
-        <w:t xml:space="preserve">Table XII: Approximations of the model</w:t>
+        <w:t xml:space="preserve">Table XIII: Approximations of the model</w:t>
       </w:r>
     </w:p>
     <w:tbl>
@@ -24428,7 +25351,7 @@
         </m:sSub>
       </m:oMath>
       <w:r>
-        <w:t xml:space="preserve"> (Table II) is untested at the pad. (2) The pad-level score includes the calibration width. (3) Pulse trains, low-going pulses and other loads and corners are not covered by Table XI.</w:t>
+        <w:t xml:space="preserve"> (Table II) is untested at the pad. (2) The pad-level score includes the calibration width. (3) Pulse trains, low-going pulses and other loads and corners are not covered by Table XII.</w:t>
       </w:r>
     </w:p>
     <w:sectPr>

</xml_diff>

<commit_message>
Document: say what A1 and A2 do; drop x_lin = x_0 from (18)
A1 with p = 1 is h = g, i.e. the measured exponent dropped, not a new
function. A2's constant is an effective number, not the device's x_0,
which is why it has its own name; the equation no longer claims equality.

Co-Authored-By: Claude Fable 5.1 <noreply@anthropic.com>
</commit_message>
<xml_diff>
--- a/results/stage_law_doc_2026-10-01/stage_law_derivation_v2.docx
+++ b/results/stage_law_doc_2026-10-01/stage_law_derivation_v2.docx
@@ -7153,48 +7153,64 @@
     </w:p>
     <w:p>
       <w:pPr>
-        <w:pStyle w:val="BodyText"/>
+        <w:pStyle w:val="FirstParagraph"/>
       </w:pPr>
       <w:r>
         <w:rPr>
-          <w:bCs/>
-          <w:b/>
+          <w:i/>
         </w:rPr>
         <w:t xml:space="preserve">A1 (gate exponent).</w:t>
       </w:r>
       <w:r>
-        <w:t xml:space="preserve"> </w:t>
-      </w:r>
-      <w:r>
-        <w:t xml:space="preserve">Replace</w:t>
-      </w:r>
-      <w:r>
-        <w:t xml:space="preserve"> </w:t>
+        <w:t xml:space="preserve"> In (15) the gate factor is </w:t>
       </w:r>
       <m:oMath>
         <m:r>
-          <m:t>α</m:t>
-        </m:r>
+          <m:t xml:space="preserve">g</m:t>
+        </m:r>
+        <m:r>
+          <m:rPr>
+            <m:sty m:val="p"/>
+          </m:rPr>
+          <m:t xml:space="preserve">(</m:t>
+        </m:r>
+        <m:r>
+          <m:t xml:space="preserve">u</m:t>
+        </m:r>
+        <m:sSup>
+          <m:e>
+            <m:r>
+              <m:rPr>
+                <m:sty m:val="p"/>
+              </m:rPr>
+              <m:t xml:space="preserve">)</m:t>
+            </m:r>
+          </m:e>
+          <m:sup>
+            <m:r>
+              <m:t xml:space="preserve">α</m:t>
+            </m:r>
+          </m:sup>
+        </m:sSup>
       </m:oMath>
       <w:r>
-        <w:t xml:space="preserve"> </w:t>
-      </w:r>
-      <w:r>
-        <w:t xml:space="preserve">in the gate factor by a model parameter</w:t>
-      </w:r>
-      <w:r>
-        <w:t xml:space="preserve"> </w:t>
+        <w:t xml:space="preserve"> with the measured device exponent </w:t>
       </w:r>
       <m:oMath>
         <m:r>
-          <m:t>p</m:t>
+          <m:t xml:space="preserve">α</m:t>
         </m:r>
       </m:oMath>
       <w:r>
-        <w:t xml:space="preserve"> </w:t>
-      </w:r>
-      <w:r>
-        <w:t xml:space="preserve">and define</w:t>
+        <w:t xml:space="preserve">, 1.10–1.63 for the devices of Table III. The model keeps the form but treats the exponent as a model parameter </w:t>
+      </w:r>
+      <m:oMath>
+        <m:r>
+          <m:t xml:space="preserve">p</m:t>
+        </m:r>
+      </m:oMath>
+      <w:r>
+        <w:t xml:space="preserve">:</w:t>
       </w:r>
     </w:p>
     <w:p>
@@ -7207,29 +7223,64 @@
         </m:oMathParaPr>
         <m:oMath>
           <m:r>
-            <m:t>h</m:t>
-          </m:r>
-          <m:d>
-            <m:dPr>
-              <m:begChr m:val="("/>
-              <m:endChr m:val=")"/>
-              <m:sepChr m:val=""/>
-              <m:grow/>
-            </m:dPr>
-            <m:e>
-              <m:r>
-                <m:t>x</m:t>
-              </m:r>
-            </m:e>
-          </m:d>
+            <m:t xml:space="preserve">h</m:t>
+          </m:r>
           <m:r>
             <m:rPr>
               <m:sty m:val="p"/>
             </m:rPr>
-            <m:t>≜</m:t>
-          </m:r>
-          <m:r>
-            <m:t>g</m:t>
+            <m:t xml:space="preserve">(</m:t>
+          </m:r>
+          <m:r>
+            <m:t xml:space="preserve">x</m:t>
+          </m:r>
+          <m:r>
+            <m:rPr>
+              <m:sty m:val="p"/>
+            </m:rPr>
+            <m:t xml:space="preserve">)</m:t>
+          </m:r>
+          <m:r>
+            <m:t xml:space="preserve">≜</m:t>
+          </m:r>
+          <m:r>
+            <m:t xml:space="preserve">g</m:t>
+          </m:r>
+          <m:r>
+            <m:rPr>
+              <m:sty m:val="p"/>
+            </m:rPr>
+            <m:t xml:space="preserve">(</m:t>
+          </m:r>
+          <m:r>
+            <m:t xml:space="preserve">x</m:t>
+          </m:r>
+          <m:sSup>
+            <m:e>
+              <m:r>
+                <m:rPr>
+                  <m:sty m:val="p"/>
+                </m:rPr>
+                <m:t xml:space="preserve">)</m:t>
+              </m:r>
+            </m:e>
+            <m:sup>
+              <m:r>
+                <m:t xml:space="preserve">p</m:t>
+              </m:r>
+            </m:sup>
+          </m:sSup>
+          <m:r>
+            <m:rPr>
+              <m:sty m:val="p"/>
+            </m:rPr>
+            <m:t xml:space="preserve">=</m:t>
+          </m:r>
+          <m:r>
+            <m:rPr>
+              <m:sty m:val="p"/>
+            </m:rPr>
+            <m:t xml:space="preserve">clip</m:t>
           </m:r>
           <m:sSup>
             <m:e>
@@ -7237,90 +7288,55 @@
                 <m:dPr>
                   <m:begChr m:val="("/>
                   <m:endChr m:val=")"/>
-                  <m:sepChr m:val=""/>
-                  <m:grow/>
-                </m:dPr>
-                <m:e>
-                  <m:r>
-                    <m:t>x</m:t>
-                  </m:r>
-                </m:e>
-              </m:d>
-            </m:e>
-            <m:sup>
-              <m:r>
-                <m:t>p</m:t>
-              </m:r>
-            </m:sup>
-          </m:sSup>
-          <m:r>
-            <m:rPr>
-              <m:sty m:val="p"/>
-            </m:rPr>
-            <m:t>=</m:t>
-          </m:r>
-          <m:r>
-            <m:rPr>
-              <m:sty m:val="p"/>
-            </m:rPr>
-            <m:t>clip</m:t>
-          </m:r>
-          <m:sSup>
-            <m:e>
-              <m:d>
-                <m:dPr>
-                  <m:begChr m:val="("/>
-                  <m:endChr m:val=")"/>
-                  <m:sepChr m:val=""/>
                   <m:grow/>
                 </m:dPr>
                 <m:e>
                   <m:f>
-                    <m:fPr>
-                      <m:type m:val="bar"/>
-                    </m:fPr>
                     <m:num>
                       <m:r>
-                        <m:t>x</m:t>
+                        <m:t xml:space="preserve">x</m:t>
                       </m:r>
                       <m:r>
                         <m:rPr>
                           <m:sty m:val="p"/>
                         </m:rPr>
-                        <m:t>−</m:t>
+                        <m:t xml:space="preserve">−</m:t>
                       </m:r>
                       <m:sSub>
                         <m:e>
                           <m:r>
-                            <m:t>v</m:t>
+                            <m:t xml:space="preserve">v</m:t>
                           </m:r>
                         </m:e>
                         <m:sub>
                           <m:r>
-                            <m:t>t</m:t>
+                            <m:t xml:space="preserve">t</m:t>
                           </m:r>
                         </m:sub>
                       </m:sSub>
                     </m:num>
                     <m:den>
                       <m:r>
-                        <m:t>1</m:t>
+                        <m:rPr>
+                          <m:sty m:val="p"/>
+                        </m:rPr>
+                        <m:t xml:space="preserve">1</m:t>
                       </m:r>
                       <m:r>
                         <m:rPr>
                           <m:sty m:val="p"/>
                         </m:rPr>
-                        <m:t>−</m:t>
+                        <m:t xml:space="preserve">−</m:t>
                       </m:r>
                       <m:sSub>
                         <m:e>
                           <m:r>
-                            <m:t>v</m:t>
+                            <m:t xml:space="preserve">v</m:t>
                           </m:r>
                         </m:e>
                         <m:sub>
                           <m:r>
-                            <m:t>t</m:t>
+                            <m:t xml:space="preserve">t</m:t>
                           </m:r>
                         </m:sub>
                       </m:sSub>
@@ -7330,54 +7346,53 @@
                     <m:rPr>
                       <m:sty m:val="p"/>
                     </m:rPr>
-                    <m:t>,</m:t>
-                  </m:r>
-                  <m:r>
-                    <m:t> </m:t>
-                  </m:r>
-                  <m:r>
-                    <m:t>0</m:t>
+                    <m:t xml:space="preserve">,</m:t>
                   </m:r>
                   <m:r>
                     <m:rPr>
                       <m:sty m:val="p"/>
                     </m:rPr>
-                    <m:t>,</m:t>
-                  </m:r>
-                  <m:r>
-                    <m:t> </m:t>
-                  </m:r>
-                  <m:r>
-                    <m:t>1</m:t>
+                    <m:t xml:space="preserve"> </m:t>
+                  </m:r>
+                  <m:r>
+                    <m:rPr>
+                      <m:sty m:val="p"/>
+                    </m:rPr>
+                    <m:t xml:space="preserve">0</m:t>
+                  </m:r>
+                  <m:r>
+                    <m:rPr>
+                      <m:sty m:val="p"/>
+                    </m:rPr>
+                    <m:t xml:space="preserve">,</m:t>
+                  </m:r>
+                  <m:r>
+                    <m:rPr>
+                      <m:sty m:val="p"/>
+                    </m:rPr>
+                    <m:t xml:space="preserve"> </m:t>
+                  </m:r>
+                  <m:r>
+                    <m:rPr>
+                      <m:sty m:val="p"/>
+                    </m:rPr>
+                    <m:t xml:space="preserve">1</m:t>
                   </m:r>
                 </m:e>
               </m:d>
             </m:e>
             <m:sup>
               <m:r>
-                <m:t>p</m:t>
+                <m:t xml:space="preserve">p</m:t>
               </m:r>
             </m:sup>
           </m:sSup>
           <m:r>
-            <m:t>  </m:t>
-          </m:r>
-          <m:r>
-            <m:t>  </m:t>
-          </m:r>
-          <m:d>
-            <m:dPr>
-              <m:begChr m:val="("/>
-              <m:endChr m:val=")"/>
-              <m:sepChr m:val=""/>
-              <m:grow/>
-            </m:dPr>
-            <m:e>
-              <m:r>
-                <m:t>17</m:t>
-              </m:r>
-            </m:e>
-          </m:d>
+            <m:rPr>
+              <m:sty m:val="p"/>
+            </m:rPr>
+            <m:t xml:space="preserve">  (17)</m:t>
+          </m:r>
         </m:oMath>
       </m:oMathPara>
     </w:p>
@@ -7386,143 +7401,219 @@
         <w:pStyle w:val="FirstParagraph"/>
       </w:pPr>
       <w:r>
-        <w:t xml:space="preserve">At full swing the stage input dwells near</w:t>
-      </w:r>
-      <w:r>
-        <w:t xml:space="preserve"> </w:t>
+        <w:t xml:space="preserve">The symbol </w:t>
       </w:r>
       <m:oMath>
         <m:r>
-          <m:t>g</m:t>
-        </m:r>
-        <m:r>
-          <m:rPr>
-            <m:sty m:val="p"/>
-          </m:rPr>
-          <m:t>=</m:t>
-        </m:r>
-        <m:r>
-          <m:t>1</m:t>
+          <m:t xml:space="preserve">h</m:t>
         </m:r>
       </m:oMath>
       <w:r>
-        <w:t xml:space="preserve">, where (17) is independent of</w:t>
-      </w:r>
-      <w:r>
-        <w:t xml:space="preserve"> </w:t>
+        <w:t xml:space="preserve"> marks nothing more than that the exponent is no longer the device's. A full-swing waveform cannot set </w:t>
       </w:r>
       <m:oMath>
         <m:r>
-          <m:t>p</m:t>
+          <m:t xml:space="preserve">p</m:t>
         </m:r>
       </m:oMath>
       <w:r>
-        <w:t xml:space="preserve">; the full-swing waveform therefore cannot identify</w:t>
-      </w:r>
-      <w:r>
-        <w:t xml:space="preserve"> </w:t>
+        <w:t xml:space="preserve">: the stage input dwells near </w:t>
       </w:r>
       <m:oMath>
         <m:r>
-          <m:t>p</m:t>
+          <m:t xml:space="preserve">g</m:t>
+        </m:r>
+        <m:r>
+          <m:rPr>
+            <m:sty m:val="p"/>
+          </m:rPr>
+          <m:t xml:space="preserve">=</m:t>
+        </m:r>
+        <m:r>
+          <m:rPr>
+            <m:sty m:val="p"/>
+          </m:rPr>
+          <m:t xml:space="preserve">1</m:t>
         </m:r>
       </m:oMath>
       <w:r>
-        <w:t xml:space="preserve">, and</w:t>
-      </w:r>
-      <w:r>
-        <w:t xml:space="preserve"> </w:t>
+        <w:t xml:space="preserve">, where </w:t>
       </w:r>
       <m:oMath>
-        <m:r>
-          <m:t>p</m:t>
-        </m:r>
-        <m:r>
-          <m:rPr>
-            <m:sty m:val="p"/>
-          </m:rPr>
-          <m:t>=</m:t>
-        </m:r>
-        <m:r>
-          <m:t>1</m:t>
+        <m:sSup>
+          <m:e>
+            <m:r>
+              <m:t xml:space="preserve">g</m:t>
+            </m:r>
+          </m:e>
+          <m:sup>
+            <m:r>
+              <m:t xml:space="preserve">p</m:t>
+            </m:r>
+          </m:sup>
+        </m:sSup>
+        <m:r>
+          <m:rPr>
+            <m:sty m:val="p"/>
+          </m:rPr>
+          <m:t xml:space="preserve">=</m:t>
+        </m:r>
+        <m:r>
+          <m:rPr>
+            <m:sty m:val="p"/>
+          </m:rPr>
+          <m:t xml:space="preserve">1</m:t>
         </m:r>
       </m:oMath>
       <w:r>
-        <w:t xml:space="preserve">, the short-channel limit of [1], is adopted as the default.</w:t>
+        <w:t xml:space="preserve"> for every </w:t>
+      </w:r>
+      <m:oMath>
+        <m:r>
+          <m:t xml:space="preserve">p</m:t>
+        </m:r>
+      </m:oMath>
+      <w:r>
+        <w:t xml:space="preserve">, and only the brief passage through intermediate drives depends on it (Section II-J). In this work </w:t>
+      </w:r>
+      <m:oMath>
+        <m:r>
+          <m:t xml:space="preserve">p</m:t>
+        </m:r>
+        <m:r>
+          <m:rPr>
+            <m:sty m:val="p"/>
+          </m:rPr>
+          <m:t xml:space="preserve">=</m:t>
+        </m:r>
+        <m:r>
+          <m:rPr>
+            <m:sty m:val="p"/>
+          </m:rPr>
+          <m:t xml:space="preserve">1</m:t>
+        </m:r>
+      </m:oMath>
+      <w:r>
+        <w:t xml:space="preserve"> is adopted, so (17) reduces to </w:t>
+      </w:r>
+      <m:oMath>
+        <m:r>
+          <m:t xml:space="preserve">h</m:t>
+        </m:r>
+        <m:r>
+          <m:rPr>
+            <m:sty m:val="p"/>
+          </m:rPr>
+          <m:t xml:space="preserve">(</m:t>
+        </m:r>
+        <m:r>
+          <m:t xml:space="preserve">x</m:t>
+        </m:r>
+        <m:r>
+          <m:rPr>
+            <m:sty m:val="p"/>
+          </m:rPr>
+          <m:t xml:space="preserve">)</m:t>
+        </m:r>
+        <m:r>
+          <m:rPr>
+            <m:sty m:val="p"/>
+          </m:rPr>
+          <m:t xml:space="preserve">=</m:t>
+        </m:r>
+        <m:r>
+          <m:t xml:space="preserve">g</m:t>
+        </m:r>
+        <m:r>
+          <m:rPr>
+            <m:sty m:val="p"/>
+          </m:rPr>
+          <m:t xml:space="preserve">(</m:t>
+        </m:r>
+        <m:r>
+          <m:t xml:space="preserve">x</m:t>
+        </m:r>
+        <m:r>
+          <m:rPr>
+            <m:sty m:val="p"/>
+          </m:rPr>
+          <m:t xml:space="preserve">)</m:t>
+        </m:r>
+      </m:oMath>
+      <w:r>
+        <w:t xml:space="preserve">. That is the approximation: A1 drops the measured exponent and makes the drive current linear in the gate above threshold, the short-channel limit of [1]. The parameter </w:t>
+      </w:r>
+      <m:oMath>
+        <m:r>
+          <m:t xml:space="preserve">p</m:t>
+        </m:r>
+      </m:oMath>
+      <w:r>
+        <w:t xml:space="preserve"> is kept in the formula only so that the exponent can be restored if a measurement supplies it.</w:t>
       </w:r>
     </w:p>
     <w:p>
       <w:pPr>
-        <w:pStyle w:val="BodyText"/>
+        <w:pStyle w:val="FirstParagraph"/>
       </w:pPr>
       <w:r>
         <w:rPr>
-          <w:bCs/>
-          <w:b/>
+          <w:i/>
         </w:rPr>
         <w:t xml:space="preserve">A2 (fixed saturation boundary).</w:t>
       </w:r>
       <w:r>
-        <w:t xml:space="preserve"> </w:t>
-      </w:r>
-      <w:r>
-        <w:t xml:space="preserve">Replace the drive-dependent boundary</w:t>
-      </w:r>
-      <w:r>
-        <w:t xml:space="preserve"> </w:t>
+        <w:t xml:space="preserve"> In (15) the boundary between the constant-current ramp and the resistive tail is </w:t>
       </w:r>
       <m:oMath>
         <m:sSub>
           <m:e>
             <m:r>
-              <m:t>x</m:t>
+              <m:t xml:space="preserve">x</m:t>
             </m:r>
           </m:e>
           <m:sub>
-            <m:r>
-              <m:t>0</m:t>
-            </m:r>
-          </m:sub>
-        </m:sSub>
-        <m:r>
-          <m:t> </m:t>
-        </m:r>
-        <m:sSup>
-          <m:e>
-            <m:r>
-              <m:t>g</m:t>
-            </m:r>
-          </m:e>
-          <m:sup>
-            <m:r>
-              <m:t>α</m:t>
-            </m:r>
             <m:r>
               <m:rPr>
                 <m:sty m:val="p"/>
               </m:rPr>
-              <m:t>/</m:t>
-            </m:r>
-            <m:r>
-              <m:t>2</m:t>
+              <m:t xml:space="preserve">0</m:t>
+            </m:r>
+          </m:sub>
+        </m:sSub>
+        <m:sSup>
+          <m:e>
+            <m:r>
+              <m:t xml:space="preserve">g</m:t>
+            </m:r>
+          </m:e>
+          <m:sup>
+            <m:r>
+              <m:t xml:space="preserve">α</m:t>
+            </m:r>
+            <m:r>
+              <m:rPr>
+                <m:sty m:val="p"/>
+              </m:rPr>
+              <m:t xml:space="preserve">/</m:t>
+            </m:r>
+            <m:r>
+              <m:rPr>
+                <m:sty m:val="p"/>
+              </m:rPr>
+              <m:t xml:space="preserve">2</m:t>
             </m:r>
           </m:sup>
         </m:sSup>
       </m:oMath>
       <w:r>
-        <w:t xml:space="preserve"> </w:t>
-      </w:r>
-      <w:r>
-        <w:t xml:space="preserve">in (15) by its full-drive value, a constant</w:t>
-      </w:r>
-      <w:r>
-        <w:t xml:space="preserve"> </w:t>
+        <w:t xml:space="preserve">: it equals </w:t>
       </w:r>
       <m:oMath>
         <m:sSub>
           <m:e>
             <m:r>
-              <m:t>x</m:t>
+              <m:t xml:space="preserve">x</m:t>
             </m:r>
           </m:e>
           <m:sub>
@@ -7530,25 +7621,13 @@
               <m:rPr>
                 <m:sty m:val="p"/>
               </m:rPr>
-              <m:t>l</m:t>
-            </m:r>
-            <m:r>
-              <m:rPr>
-                <m:sty m:val="p"/>
-              </m:rPr>
-              <m:t>i</m:t>
-            </m:r>
-            <m:r>
-              <m:rPr>
-                <m:sty m:val="p"/>
-              </m:rPr>
-              <m:t>n</m:t>
+              <m:t xml:space="preserve">0</m:t>
             </m:r>
           </m:sub>
         </m:sSub>
       </m:oMath>
       <w:r>
-        <w:t xml:space="preserve">, and define</w:t>
+        <w:t xml:space="preserve"> at full drive and shrinks when the gate is only partly on. The model replaces it by a constant that does not depend on the gate:</w:t>
       </w:r>
     </w:p>
     <w:p>
@@ -7561,87 +7640,79 @@
         </m:oMathParaPr>
         <m:oMath>
           <m:r>
-            <m:t>r</m:t>
+            <m:t xml:space="preserve">r</m:t>
+          </m:r>
+          <m:r>
+            <m:rPr>
+              <m:sty m:val="p"/>
+            </m:rPr>
+            <m:t xml:space="preserve">(</m:t>
+          </m:r>
+          <m:r>
+            <m:t xml:space="preserve">x</m:t>
+          </m:r>
+          <m:r>
+            <m:rPr>
+              <m:sty m:val="p"/>
+            </m:rPr>
+            <m:t xml:space="preserve">)</m:t>
+          </m:r>
+          <m:r>
+            <m:t xml:space="preserve">≜</m:t>
+          </m:r>
+          <m:r>
+            <m:rPr>
+              <m:sty m:val="p"/>
+            </m:rPr>
+            <m:t xml:space="preserve">min</m:t>
           </m:r>
           <m:d>
             <m:dPr>
               <m:begChr m:val="("/>
               <m:endChr m:val=")"/>
-              <m:sepChr m:val=""/>
               <m:grow/>
             </m:dPr>
             <m:e>
               <m:r>
-                <m:t>x</m:t>
-              </m:r>
-            </m:e>
-          </m:d>
-          <m:r>
-            <m:rPr>
-              <m:sty m:val="p"/>
-            </m:rPr>
-            <m:t>≜</m:t>
-          </m:r>
-          <m:r>
-            <m:rPr>
-              <m:sty m:val="p"/>
-            </m:rPr>
-            <m:t>min</m:t>
-          </m:r>
-          <m:d>
-            <m:dPr>
-              <m:begChr m:val="("/>
-              <m:endChr m:val=")"/>
-              <m:sepChr m:val=""/>
-              <m:grow/>
-            </m:dPr>
-            <m:e>
-              <m:r>
-                <m:t>1</m:t>
-              </m:r>
-              <m:r>
                 <m:rPr>
                   <m:sty m:val="p"/>
                 </m:rPr>
-                <m:t>,</m:t>
-              </m:r>
-              <m:r>
-                <m:t> </m:t>
+                <m:t xml:space="preserve">1</m:t>
+              </m:r>
+              <m:r>
+                <m:rPr>
+                  <m:sty m:val="p"/>
+                </m:rPr>
+                <m:t xml:space="preserve">,</m:t>
+              </m:r>
+              <m:r>
+                <m:rPr>
+                  <m:sty m:val="p"/>
+                </m:rPr>
+                <m:t xml:space="preserve"> </m:t>
               </m:r>
               <m:f>
-                <m:fPr>
-                  <m:type m:val="bar"/>
-                </m:fPr>
                 <m:num>
                   <m:r>
-                    <m:t>x</m:t>
+                    <m:t xml:space="preserve">x</m:t>
                   </m:r>
                 </m:num>
                 <m:den>
                   <m:sSub>
                     <m:e>
                       <m:r>
-                        <m:t>x</m:t>
+                        <m:t xml:space="preserve">x</m:t>
                       </m:r>
                     </m:e>
                     <m:sub>
                       <m:r>
-                        <m:rPr>
-                          <m:sty m:val="p"/>
-                        </m:rPr>
-                        <m:t>l</m:t>
+                        <m:t xml:space="preserve">l</m:t>
                       </m:r>
                       <m:r>
-                        <m:rPr>
-                          <m:sty m:val="p"/>
-                        </m:rPr>
-                        <m:t>i</m:t>
+                        <m:t xml:space="preserve">i</m:t>
                       </m:r>
                       <m:r>
-                        <m:rPr>
-                          <m:sty m:val="p"/>
-                        </m:rPr>
-                        <m:t>n</m:t>
+                        <m:t xml:space="preserve">n</m:t>
                       </m:r>
                     </m:sub>
                   </m:sSub>
@@ -7653,75 +7724,8 @@
             <m:rPr>
               <m:sty m:val="p"/>
             </m:rPr>
-            <m:t>,</m:t>
-          </m:r>
-          <m:r>
-            <m:t>  </m:t>
-          </m:r>
-          <m:sSub>
-            <m:e>
-              <m:r>
-                <m:t>x</m:t>
-              </m:r>
-            </m:e>
-            <m:sub>
-              <m:r>
-                <m:rPr>
-                  <m:sty m:val="p"/>
-                </m:rPr>
-                <m:t>l</m:t>
-              </m:r>
-              <m:r>
-                <m:rPr>
-                  <m:sty m:val="p"/>
-                </m:rPr>
-                <m:t>i</m:t>
-              </m:r>
-              <m:r>
-                <m:rPr>
-                  <m:sty m:val="p"/>
-                </m:rPr>
-                <m:t>n</m:t>
-              </m:r>
-            </m:sub>
-          </m:sSub>
-          <m:r>
-            <m:rPr>
-              <m:sty m:val="p"/>
-            </m:rPr>
-            <m:t>=</m:t>
-          </m:r>
-          <m:sSub>
-            <m:e>
-              <m:r>
-                <m:t>x</m:t>
-              </m:r>
-            </m:e>
-            <m:sub>
-              <m:r>
-                <m:t>0</m:t>
-              </m:r>
-            </m:sub>
-          </m:sSub>
-          <m:r>
-            <m:t>  </m:t>
-          </m:r>
-          <m:r>
-            <m:t>  </m:t>
-          </m:r>
-          <m:d>
-            <m:dPr>
-              <m:begChr m:val="("/>
-              <m:endChr m:val=")"/>
-              <m:sepChr m:val=""/>
-              <m:grow/>
-            </m:dPr>
-            <m:e>
-              <m:r>
-                <m:t>18</m:t>
-              </m:r>
-            </m:e>
-          </m:d>
+            <m:t xml:space="preserve">  (18)</m:t>
+          </m:r>
         </m:oMath>
       </m:oMathPara>
     </w:p>
@@ -7730,27 +7734,114 @@
         <w:pStyle w:val="FirstParagraph"/>
       </w:pPr>
       <w:r>
-        <w:t xml:space="preserve">At</w:t>
-      </w:r>
-      <w:r>
-        <w:t xml:space="preserve"> </w:t>
+        <w:t xml:space="preserve">For a known device the natural value is the full-drive boundary, </w:t>
       </w:r>
       <m:oMath>
-        <m:r>
-          <m:t>g</m:t>
-        </m:r>
-        <m:r>
-          <m:rPr>
-            <m:sty m:val="p"/>
-          </m:rPr>
-          <m:t>=</m:t>
-        </m:r>
-        <m:r>
-          <m:t>1</m:t>
-        </m:r>
+        <m:sSub>
+          <m:e>
+            <m:r>
+              <m:t xml:space="preserve">x</m:t>
+            </m:r>
+          </m:e>
+          <m:sub>
+            <m:r>
+              <m:t xml:space="preserve">l</m:t>
+            </m:r>
+            <m:r>
+              <m:t xml:space="preserve">i</m:t>
+            </m:r>
+            <m:r>
+              <m:t xml:space="preserve">n</m:t>
+            </m:r>
+          </m:sub>
+        </m:sSub>
+        <m:r>
+          <m:rPr>
+            <m:sty m:val="p"/>
+          </m:rPr>
+          <m:t xml:space="preserve">=</m:t>
+        </m:r>
+        <m:sSub>
+          <m:e>
+            <m:r>
+              <m:t xml:space="preserve">x</m:t>
+            </m:r>
+          </m:e>
+          <m:sub>
+            <m:r>
+              <m:rPr>
+                <m:sty m:val="p"/>
+              </m:rPr>
+              <m:t xml:space="preserve">0</m:t>
+            </m:r>
+          </m:sub>
+        </m:sSub>
       </m:oMath>
       <w:r>
-        <w:t xml:space="preserve">, (18) coincides with the boundary in (15); the two differ only under partial drive.</w:t>
+        <w:t xml:space="preserve">, and at </w:t>
+      </w:r>
+      <m:oMath>
+        <m:r>
+          <m:t xml:space="preserve">g</m:t>
+        </m:r>
+        <m:r>
+          <m:rPr>
+            <m:sty m:val="p"/>
+          </m:rPr>
+          <m:t xml:space="preserve">=</m:t>
+        </m:r>
+        <m:r>
+          <m:rPr>
+            <m:sty m:val="p"/>
+          </m:rPr>
+          <m:t xml:space="preserve">1</m:t>
+        </m:r>
+      </m:oMath>
+      <w:r>
+        <w:t xml:space="preserve"> (18) then coincides with the boundary in (15); the two differ only under partial drive. The model, however, never knows the device, so the constant is given its own name: </w:t>
+      </w:r>
+      <m:oMath>
+        <m:sSub>
+          <m:e>
+            <m:r>
+              <m:t xml:space="preserve">x</m:t>
+            </m:r>
+          </m:e>
+          <m:sub>
+            <m:r>
+              <m:t xml:space="preserve">l</m:t>
+            </m:r>
+            <m:r>
+              <m:t xml:space="preserve">i</m:t>
+            </m:r>
+            <m:r>
+              <m:t xml:space="preserve">n</m:t>
+            </m:r>
+          </m:sub>
+        </m:sSub>
+      </m:oMath>
+      <w:r>
+        <w:t xml:space="preserve"> is an effective number, set to 0.45 in this work for the reasons given after Fig. 3, and the measured </w:t>
+      </w:r>
+      <m:oMath>
+        <m:sSub>
+          <m:e>
+            <m:r>
+              <m:t xml:space="preserve">x</m:t>
+            </m:r>
+          </m:e>
+          <m:sub>
+            <m:r>
+              <m:rPr>
+                <m:sty m:val="p"/>
+              </m:rPr>
+              <m:t xml:space="preserve">0</m:t>
+            </m:r>
+          </m:sub>
+        </m:sSub>
+      </m:oMath>
+      <w:r>
+        <w:t xml:space="preserve"> of Table III (0.34–0.57) is only a check on it.</w:t>
       </w:r>
     </w:p>
     <w:p>
@@ -25869,7 +25960,7 @@
               <w:rPr>
                 <w:sz w:val="18"/>
               </w:rPr>
-              <w:t xml:space="preserve">Fixed value replacing </w:t>
+              <w:t xml:space="preserve">Effective constant replacing the drive-dependent boundary </w:t>
             </w:r>
             <m:oMath>
               <m:sSub>
@@ -25912,6 +26003,12 @@
                 </m:sup>
               </m:sSup>
             </m:oMath>
+            <w:r>
+              <w:rPr>
+                <w:sz w:val="18"/>
+              </w:rPr>
+              <w:t xml:space="preserve">; 0.45 unless fitted</w:t>
+            </w:r>
           </w:p>
         </w:tc>
         <w:tc>

</xml_diff>